<commit_message>
Redraw Figure 2 as a conventional signed covariate-balance plot
The PSM balance figure previously showed all-positive standardized
differences with only a +10% guide, which does not follow standard
balance-diagnostic practice. Redrawn in the conventional (pstest-style)
form: signed standardized bias per covariate, sorted by absolute
pre-match bias, solid zero line and dashed ±10% thresholds, with all
post-match biases within ±5%. Caption and Section 4.2.2 text updated to
describe the signed bias and threshold explicitly.

Co-Authored-By: Claude Fable 5 <noreply@anthropic.com>
Claude-Session: https://claude.ai/code/session_01D4xmAkDKwnFZcWjChhtKdD
</commit_message>
<xml_diff>
--- a/work/out/Zhejiang_Youth_Employment_Systems.docx
+++ b/work/out/Zhejiang_Youth_Employment_Systems.docx
@@ -15257,7 +15257,7 @@
           <w:i w:val="0"/>
           <w:sz w:val="20"/>
         </w:rPr>
-        <w:t xml:space="preserve"> remains positive and statistically significant after matching, suggesting that our main finding is not driven by observable differences between high- and low-transformation firms. Figure 2 further shows improved covariate balance after matching.</w:t>
+        <w:t xml:space="preserve"> remains positive and statistically significant after matching, suggesting that our main finding is not driven by observable differences between high- and low-transformation firms. Figure 2 reports the signed standardized bias of each covariate before and after matching. After matching, the absolute standardized bias of every covariate falls from as high as 27.6% to below 5%, well within the conventional 10% threshold, indicating that the matching procedure achieves satisfactory covariate balance.</w:t>
       </w:r>
     </w:p>
     <w:p>
@@ -16486,7 +16486,7 @@
           <w:i w:val="0"/>
           <w:sz w:val="17"/>
         </w:rPr>
-        <w:t>Standardized mean differences of covariates: pre-match vs. post-match.</w:t>
+        <w:t>Covariate balance before and after matching. Hollow circles (crosses) show the signed standardized bias (%) of each covariate in the unmatched (matched) sample; covariates are ordered by absolute pre-match bias, and the dashed lines mark the conventional ±10% threshold.</w:t>
       </w:r>
     </w:p>
     <w:p>

</xml_diff>